<commit_message>
[ADD] CFA + ZIP
</commit_message>
<xml_diff>
--- a/fuentes/CF2_52450388_DI.docx
+++ b/fuentes/CF2_52450388_DI.docx
@@ -8969,14 +8969,8 @@
         <w:rPr>
           <w:rFonts w:ascii="Calibri" w:hAnsi="Calibri" w:cs="Calibri"/>
         </w:rPr>
-        <w:t xml:space="preserve">Trazar un ángulo recto. Sobre la línea horizontal marcar la medida del escote de la espalda (punto A) y, a continuación, la medida del escote del delantero (punto B). Sobre la línea vertical, marcar: 2.5 cm </w:t>
-      </w:r>
-      <w:r>
-        <w:rPr>
-          <w:rFonts w:ascii="Calibri" w:hAnsi="Calibri" w:cs="Calibri"/>
-        </w:rPr>
         <w:lastRenderedPageBreak/>
-        <w:t>para el pie de cuello (punto C), 1.5 cm para la pinza (punto D) y 4.5 cm para el ancho del cuello (punto E).</w:t>
+        <w:t>Trazar un ángulo recto. Sobre la línea horizontal marcar la medida del escote de la espalda (punto A) y, a continuación, la medida del escote del delantero (punto B). Sobre la línea vertical, marcar: 2.5 cm para el pie de cuello (punto C), 1.5 cm para la pinza (punto D) y 4.5 cm para el ancho del cuello (punto E).</w:t>
       </w:r>
     </w:p>
     <w:p>
@@ -9298,6 +9292,7 @@
         <w:rPr>
           <w:rFonts w:ascii="Calibri" w:hAnsi="Calibri" w:cs="Calibri"/>
         </w:rPr>
+        <w:lastRenderedPageBreak/>
         <w:t>El cuello y el pie de cuello se trazan con doblez de tela sobre la línea vertical, correspondiente al vértice del ángulo.</w:t>
       </w:r>
     </w:p>
@@ -9316,7 +9311,6 @@
         <w:rPr>
           <w:rFonts w:ascii="Calibri" w:hAnsi="Calibri" w:cs="Calibri"/>
         </w:rPr>
-        <w:lastRenderedPageBreak/>
         <w:t>El despiece del pie de cuello se construye a partir del vértice del ángulo, pasando por el punto A, el cruce del pie de cuello, la curva, el punto G y el punto C, cerrando en el doblez de la tela. Se deben marcar piquetes en el punto A y dejar costura de 1 cm en todo el contorno.</w:t>
       </w:r>
     </w:p>
@@ -9588,6 +9582,7 @@
           <w:rFonts w:ascii="Calibri" w:hAnsi="Calibri" w:cs="Calibri"/>
           <w:b/>
         </w:rPr>
+        <w:lastRenderedPageBreak/>
         <w:t>Figura 29</w:t>
       </w:r>
       <w:r>
@@ -9622,7 +9617,6 @@
           <w:noProof/>
           <w:lang w:eastAsia="es-CO"/>
         </w:rPr>
-        <w:lastRenderedPageBreak/>
         <w:drawing>
           <wp:inline distT="0" distB="0" distL="0" distR="0" wp14:anchorId="1BF6FA9C" wp14:editId="03688C48">
             <wp:extent cx="3582209" cy="1536700"/>
@@ -9996,6 +9990,7 @@
           <w:rFonts w:ascii="Calibri" w:hAnsi="Calibri" w:cs="Calibri"/>
           <w:b/>
         </w:rPr>
+        <w:lastRenderedPageBreak/>
         <w:t>Tabla 2. Medidas para desarrollo de pantalón T M</w:t>
       </w:r>
       <w:r>
@@ -10074,7 +10069,6 @@
                 <w:bCs/>
                 <w:color w:val="000000"/>
               </w:rPr>
-              <w:lastRenderedPageBreak/>
               <w:t xml:space="preserve">Medida </w:t>
             </w:r>
           </w:p>
@@ -18169,7 +18163,18 @@
                 <w:sz w:val="22"/>
                 <w:szCs w:val="22"/>
               </w:rPr>
-              <w:t>Video</w:t>
+              <w:t>Vid</w:t>
+            </w:r>
+            <w:bookmarkStart w:id="73" w:name="_GoBack"/>
+            <w:bookmarkEnd w:id="73"/>
+            <w:r>
+              <w:rPr>
+                <w:rFonts w:ascii="Calibri" w:eastAsia="Calibri" w:hAnsi="Calibri" w:cs="Calibri"/>
+                <w:b w:val="0"/>
+                <w:sz w:val="22"/>
+                <w:szCs w:val="22"/>
+              </w:rPr>
+              <w:t>eo</w:t>
             </w:r>
           </w:p>
         </w:tc>
@@ -18201,211 +18206,6 @@
                   <w:szCs w:val="22"/>
                 </w:rPr>
                 <w:t>https://www.youtube.com/watch?v=fx7tmoiqPfI</w:t>
-              </w:r>
-            </w:hyperlink>
-          </w:p>
-          <w:p>
-            <w:pPr>
-              <w:pStyle w:val="Normal0"/>
-              <w:rPr>
-                <w:rFonts w:ascii="Calibri" w:hAnsi="Calibri" w:cs="Calibri"/>
-                <w:sz w:val="22"/>
-                <w:szCs w:val="22"/>
-              </w:rPr>
-            </w:pPr>
-          </w:p>
-        </w:tc>
-      </w:tr>
-      <w:tr>
-        <w:trPr>
-          <w:trHeight w:val="385"/>
-        </w:trPr>
-        <w:tc>
-          <w:tcPr>
-            <w:tcW w:w="2517" w:type="dxa"/>
-            <w:tcMar>
-              <w:top w:w="100" w:type="dxa"/>
-              <w:left w:w="100" w:type="dxa"/>
-              <w:bottom w:w="100" w:type="dxa"/>
-              <w:right w:w="100" w:type="dxa"/>
-            </w:tcMar>
-          </w:tcPr>
-          <w:p>
-            <w:pPr>
-              <w:pStyle w:val="Normal0"/>
-              <w:rPr>
-                <w:rFonts w:ascii="Calibri" w:hAnsi="Calibri" w:cs="Calibri"/>
-                <w:sz w:val="22"/>
-                <w:szCs w:val="22"/>
-              </w:rPr>
-            </w:pPr>
-            <w:r>
-              <w:rPr>
-                <w:rFonts w:ascii="Calibri" w:hAnsi="Calibri" w:cs="Calibri"/>
-                <w:sz w:val="22"/>
-                <w:szCs w:val="22"/>
-              </w:rPr>
-              <w:t>Elaboración de patronaje masculino</w:t>
-            </w:r>
-          </w:p>
-        </w:tc>
-        <w:tc>
-          <w:tcPr>
-            <w:tcW w:w="2517" w:type="dxa"/>
-            <w:tcMar>
-              <w:top w:w="100" w:type="dxa"/>
-              <w:left w:w="100" w:type="dxa"/>
-              <w:bottom w:w="100" w:type="dxa"/>
-              <w:right w:w="100" w:type="dxa"/>
-            </w:tcMar>
-          </w:tcPr>
-          <w:p>
-            <w:pPr>
-              <w:pStyle w:val="Normal0"/>
-              <w:rPr>
-                <w:rFonts w:ascii="Calibri" w:hAnsi="Calibri" w:cs="Calibri"/>
-                <w:sz w:val="22"/>
-                <w:szCs w:val="22"/>
-              </w:rPr>
-            </w:pPr>
-            <w:r>
-              <w:rPr>
-                <w:rFonts w:ascii="Calibri" w:hAnsi="Calibri" w:cs="Calibri"/>
-                <w:sz w:val="22"/>
-                <w:szCs w:val="22"/>
-              </w:rPr>
-              <w:t xml:space="preserve">Carrera de Diseño y Gestión de Moda. (2015). </w:t>
-            </w:r>
-            <w:r>
-              <w:rPr>
-                <w:rFonts w:ascii="Calibri" w:hAnsi="Calibri" w:cs="Calibri"/>
-                <w:i/>
-                <w:iCs/>
-                <w:sz w:val="22"/>
-                <w:szCs w:val="22"/>
-              </w:rPr>
-              <w:t>Técnicas de patronaje. Tomo II: Hombre</w:t>
-            </w:r>
-            <w:r>
-              <w:rPr>
-                <w:rFonts w:ascii="Calibri" w:hAnsi="Calibri" w:cs="Calibri"/>
-                <w:sz w:val="22"/>
-                <w:szCs w:val="22"/>
-              </w:rPr>
-              <w:t xml:space="preserve">. Universidad </w:t>
-            </w:r>
-            <w:r>
-              <w:rPr>
-                <w:rFonts w:ascii="Calibri" w:hAnsi="Calibri" w:cs="Calibri"/>
-                <w:sz w:val="22"/>
-                <w:szCs w:val="22"/>
-              </w:rPr>
-              <w:lastRenderedPageBreak/>
-              <w:t xml:space="preserve">Peruana de Ciencias Aplicadas (UPC). </w:t>
-            </w:r>
-            <w:proofErr w:type="spellStart"/>
-            <w:r>
-              <w:rPr>
-                <w:rFonts w:ascii="Calibri" w:hAnsi="Calibri" w:cs="Calibri"/>
-                <w:sz w:val="22"/>
-                <w:szCs w:val="22"/>
-              </w:rPr>
-              <w:t>ProQuest</w:t>
-            </w:r>
-            <w:proofErr w:type="spellEnd"/>
-            <w:r>
-              <w:rPr>
-                <w:rFonts w:ascii="Calibri" w:hAnsi="Calibri" w:cs="Calibri"/>
-                <w:sz w:val="22"/>
-                <w:szCs w:val="22"/>
-              </w:rPr>
-              <w:t xml:space="preserve"> </w:t>
-            </w:r>
-            <w:proofErr w:type="spellStart"/>
-            <w:r>
-              <w:rPr>
-                <w:rFonts w:ascii="Calibri" w:hAnsi="Calibri" w:cs="Calibri"/>
-                <w:sz w:val="22"/>
-                <w:szCs w:val="22"/>
-              </w:rPr>
-              <w:t>Ebook</w:t>
-            </w:r>
-            <w:proofErr w:type="spellEnd"/>
-            <w:r>
-              <w:rPr>
-                <w:rFonts w:ascii="Calibri" w:hAnsi="Calibri" w:cs="Calibri"/>
-                <w:sz w:val="22"/>
-                <w:szCs w:val="22"/>
-              </w:rPr>
-              <w:t xml:space="preserve"> Central.</w:t>
-            </w:r>
-          </w:p>
-        </w:tc>
-        <w:tc>
-          <w:tcPr>
-            <w:tcW w:w="2519" w:type="dxa"/>
-            <w:tcMar>
-              <w:top w:w="100" w:type="dxa"/>
-              <w:left w:w="100" w:type="dxa"/>
-              <w:bottom w:w="100" w:type="dxa"/>
-              <w:right w:w="100" w:type="dxa"/>
-            </w:tcMar>
-          </w:tcPr>
-          <w:p>
-            <w:pPr>
-              <w:pStyle w:val="Normal0"/>
-              <w:rPr>
-                <w:rFonts w:ascii="Calibri" w:hAnsi="Calibri" w:cs="Calibri"/>
-                <w:sz w:val="22"/>
-                <w:szCs w:val="22"/>
-              </w:rPr>
-            </w:pPr>
-            <w:r>
-              <w:rPr>
-                <w:rFonts w:ascii="Calibri" w:hAnsi="Calibri" w:cs="Calibri"/>
-                <w:b w:val="0"/>
-                <w:sz w:val="22"/>
-                <w:szCs w:val="22"/>
-              </w:rPr>
-              <w:lastRenderedPageBreak/>
-              <w:t>Documento</w:t>
-            </w:r>
-          </w:p>
-        </w:tc>
-        <w:tc>
-          <w:tcPr>
-            <w:tcW w:w="2519" w:type="dxa"/>
-            <w:tcMar>
-              <w:top w:w="100" w:type="dxa"/>
-              <w:left w:w="100" w:type="dxa"/>
-              <w:bottom w:w="100" w:type="dxa"/>
-              <w:right w:w="100" w:type="dxa"/>
-            </w:tcMar>
-          </w:tcPr>
-          <w:p>
-            <w:pPr>
-              <w:pStyle w:val="Normal0"/>
-              <w:rPr>
-                <w:rFonts w:ascii="Calibri" w:hAnsi="Calibri" w:cs="Calibri"/>
-                <w:sz w:val="22"/>
-                <w:szCs w:val="22"/>
-              </w:rPr>
-            </w:pPr>
-            <w:hyperlink r:id="rId71" w:history="1">
-              <w:r>
-                <w:rPr>
-                  <w:rStyle w:val="Hipervnculo"/>
-                  <w:rFonts w:ascii="Calibri" w:hAnsi="Calibri" w:cs="Calibri"/>
-                </w:rPr>
-                <w:t>https://sena4.sharepoint.com/:f:/r/sites/VirtualizacionRED/Documentos%20compartidos</w:t>
-              </w:r>
-              <w:r>
-                <w:rPr>
-                  <w:rStyle w:val="Hipervnculo"/>
-                  <w:rFonts w:ascii="Calibri" w:hAnsi="Calibri" w:cs="Calibri"/>
-                </w:rPr>
-                <w:lastRenderedPageBreak/>
-                <w:t>/2025/LP-Santander/COMPLEMENTARIAS/52450388.%20Patronaje%20industrial%20masculino/1.%20FinalxVirtualizar/Contenidos/CF02/Formatos%20DI/Anexos?csf=1&amp;web=1&amp;e=7xidZ7</w:t>
               </w:r>
             </w:hyperlink>
           </w:p>
@@ -18531,6 +18331,7 @@
                 <w:sz w:val="22"/>
                 <w:szCs w:val="22"/>
               </w:rPr>
+              <w:lastRenderedPageBreak/>
               <w:t>TÉRMINO</w:t>
             </w:r>
           </w:p>
@@ -19375,7 +19176,6 @@
                 <w:sz w:val="22"/>
                 <w:szCs w:val="22"/>
               </w:rPr>
-              <w:lastRenderedPageBreak/>
               <w:t>Moldes</w:t>
             </w:r>
             <w:r>
@@ -19974,8 +19774,6 @@
           <w:szCs w:val="22"/>
         </w:rPr>
       </w:pPr>
-      <w:bookmarkStart w:id="73" w:name="_GoBack"/>
-      <w:bookmarkEnd w:id="73"/>
     </w:p>
     <w:p>
       <w:pPr>
@@ -21013,7 +20811,6 @@
                 <w:bCs/>
                 <w:lang w:eastAsia="es-CO"/>
               </w:rPr>
-              <w:lastRenderedPageBreak/>
               <w:t> </w:t>
             </w:r>
           </w:p>
@@ -21048,7 +20845,6 @@
                 <w:bCs/>
                 <w:lang w:eastAsia="es-CO"/>
               </w:rPr>
-              <w:lastRenderedPageBreak/>
               <w:t>Julio</w:t>
             </w:r>
             <w:r>
@@ -21099,8 +20895,8 @@
     </w:tbl>
     <w:p/>
     <w:sectPr>
-      <w:headerReference w:type="default" r:id="rId72"/>
-      <w:footerReference w:type="default" r:id="rId73"/>
+      <w:headerReference w:type="default" r:id="rId71"/>
+      <w:footerReference w:type="default" r:id="rId72"/>
       <w:pgSz w:w="12240" w:h="15840"/>
       <w:pgMar w:top="1701" w:right="1134" w:bottom="1134" w:left="1134" w:header="720" w:footer="0" w:gutter="0"/>
       <w:pgNumType w:start="1"/>
@@ -28962,8 +28758,8 @@
 <file path=customXml/item1.xml><?xml version="1.0" encoding="utf-8"?>
 <p:properties xmlns:p="http://schemas.microsoft.com/office/2006/metadata/properties" xmlns:xsi="http://www.w3.org/2001/XMLSchema-instance" xmlns:pc="http://schemas.microsoft.com/office/infopath/2007/PartnerControls">
   <documentManagement>
-    <TaxCatchAll xmlns="285d351f-f218-493a-825f-85a9dfbde315" xsi:nil="true"/>
-    <lcf76f155ced4ddcb4097134ff3c332f xmlns="55abea07-cd72-4a95-add0-1082a24cf9e9">
+    <TaxCatchAll xmlns="cb45339b-ced9-4d0d-8f64-77573914d53b" xsi:nil="true"/>
+    <lcf76f155ced4ddcb4097134ff3c332f xmlns="43a3ca16-9c26-4813-b83f-4aec9927b43f">
       <Terms xmlns="http://schemas.microsoft.com/office/infopath/2007/PartnerControls"/>
     </lcf76f155ced4ddcb4097134ff3c332f>
   </documentManagement>
@@ -28986,26 +28782,30 @@
 </file>
 
 <file path=customXml/item4.xml><?xml version="1.0" encoding="utf-8"?>
-<ct:contentTypeSchema xmlns:ct="http://schemas.microsoft.com/office/2006/metadata/contentType" xmlns:ma="http://schemas.microsoft.com/office/2006/metadata/properties/metaAttributes" ct:_="" ma:_="" ma:contentTypeName="Documento" ma:contentTypeID="0x0101005D7421CBAB376F47AC1876466873BE0C" ma:contentTypeVersion="11" ma:contentTypeDescription="Crear nuevo documento." ma:contentTypeScope="" ma:versionID="2b4f891a1a5ad88e3e621500c8553ae4">
-  <xsd:schema xmlns:xsd="http://www.w3.org/2001/XMLSchema" xmlns:xs="http://www.w3.org/2001/XMLSchema" xmlns:p="http://schemas.microsoft.com/office/2006/metadata/properties" xmlns:ns2="55abea07-cd72-4a95-add0-1082a24cf9e9" xmlns:ns3="285d351f-f218-493a-825f-85a9dfbde315" targetNamespace="http://schemas.microsoft.com/office/2006/metadata/properties" ma:root="true" ma:fieldsID="4883b2e7c543eac85f1b7e21127c6f20" ns2:_="" ns3:_="">
-    <xsd:import namespace="55abea07-cd72-4a95-add0-1082a24cf9e9"/>
-    <xsd:import namespace="285d351f-f218-493a-825f-85a9dfbde315"/>
+<ct:contentTypeSchema xmlns:ct="http://schemas.microsoft.com/office/2006/metadata/contentType" xmlns:ma="http://schemas.microsoft.com/office/2006/metadata/properties/metaAttributes" ct:_="" ma:_="" ma:contentTypeName="Documento" ma:contentTypeID="0x01010049282E1EDBE9234EA9E6D38F720E265F" ma:contentTypeVersion="15" ma:contentTypeDescription="Crear nuevo documento." ma:contentTypeScope="" ma:versionID="246b9718a1b9e2bc583861675276bcbc">
+  <xsd:schema xmlns:xsd="http://www.w3.org/2001/XMLSchema" xmlns:xs="http://www.w3.org/2001/XMLSchema" xmlns:p="http://schemas.microsoft.com/office/2006/metadata/properties" xmlns:ns2="cb45339b-ced9-4d0d-8f64-77573914d53b" xmlns:ns3="43a3ca16-9c26-4813-b83f-4aec9927b43f" targetNamespace="http://schemas.microsoft.com/office/2006/metadata/properties" ma:root="true" ma:fieldsID="7377b0d4658e4b0f597d3558396b6c62" ns2:_="" ns3:_="">
+    <xsd:import namespace="cb45339b-ced9-4d0d-8f64-77573914d53b"/>
+    <xsd:import namespace="43a3ca16-9c26-4813-b83f-4aec9927b43f"/>
     <xsd:element name="properties">
       <xsd:complexType>
         <xsd:sequence>
           <xsd:element name="documentManagement">
             <xsd:complexType>
               <xsd:all>
-                <xsd:element ref="ns2:MediaServiceMetadata" minOccurs="0"/>
-                <xsd:element ref="ns2:MediaServiceFastMetadata" minOccurs="0"/>
-                <xsd:element ref="ns2:MediaServiceSearchProperties" minOccurs="0"/>
-                <xsd:element ref="ns2:MediaServiceDateTaken" minOccurs="0"/>
-                <xsd:element ref="ns2:lcf76f155ced4ddcb4097134ff3c332f" minOccurs="0"/>
-                <xsd:element ref="ns3:TaxCatchAll" minOccurs="0"/>
-                <xsd:element ref="ns2:MediaServiceOCR" minOccurs="0"/>
-                <xsd:element ref="ns2:MediaServiceGenerationTime" minOccurs="0"/>
-                <xsd:element ref="ns2:MediaServiceEventHashCode" minOccurs="0"/>
-                <xsd:element ref="ns2:MediaLengthInSeconds" minOccurs="0"/>
+                <xsd:element ref="ns2:SharedWithUsers" minOccurs="0"/>
+                <xsd:element ref="ns2:SharedWithDetails" minOccurs="0"/>
+                <xsd:element ref="ns3:MediaServiceMetadata" minOccurs="0"/>
+                <xsd:element ref="ns3:MediaServiceFastMetadata" minOccurs="0"/>
+                <xsd:element ref="ns3:MediaServiceDateTaken" minOccurs="0"/>
+                <xsd:element ref="ns3:MediaServiceObjectDetectorVersions" minOccurs="0"/>
+                <xsd:element ref="ns3:MediaLengthInSeconds" minOccurs="0"/>
+                <xsd:element ref="ns3:MediaServiceLocation" minOccurs="0"/>
+                <xsd:element ref="ns3:MediaServiceGenerationTime" minOccurs="0"/>
+                <xsd:element ref="ns3:MediaServiceEventHashCode" minOccurs="0"/>
+                <xsd:element ref="ns3:lcf76f155ced4ddcb4097134ff3c332f" minOccurs="0"/>
+                <xsd:element ref="ns2:TaxCatchAll" minOccurs="0"/>
+                <xsd:element ref="ns3:MediaServiceOCR" minOccurs="0"/>
+                <xsd:element ref="ns3:MediaServiceSearchProperties" minOccurs="0"/>
               </xsd:all>
             </xsd:complexType>
           </xsd:element>
@@ -29013,41 +28813,78 @@
       </xsd:complexType>
     </xsd:element>
   </xsd:schema>
-  <xsd:schema xmlns:xsd="http://www.w3.org/2001/XMLSchema" xmlns:xs="http://www.w3.org/2001/XMLSchema" xmlns:dms="http://schemas.microsoft.com/office/2006/documentManagement/types" xmlns:pc="http://schemas.microsoft.com/office/infopath/2007/PartnerControls" targetNamespace="55abea07-cd72-4a95-add0-1082a24cf9e9" elementFormDefault="qualified">
+  <xsd:schema xmlns:xsd="http://www.w3.org/2001/XMLSchema" xmlns:xs="http://www.w3.org/2001/XMLSchema" xmlns:dms="http://schemas.microsoft.com/office/2006/documentManagement/types" xmlns:pc="http://schemas.microsoft.com/office/infopath/2007/PartnerControls" targetNamespace="cb45339b-ced9-4d0d-8f64-77573914d53b" elementFormDefault="qualified">
     <xsd:import namespace="http://schemas.microsoft.com/office/2006/documentManagement/types"/>
     <xsd:import namespace="http://schemas.microsoft.com/office/infopath/2007/PartnerControls"/>
-    <xsd:element name="MediaServiceMetadata" ma:index="8" nillable="true" ma:displayName="MediaServiceMetadata" ma:hidden="true" ma:internalName="MediaServiceMetadata" ma:readOnly="true">
+    <xsd:element name="SharedWithUsers" ma:index="8" nillable="true" ma:displayName="Compartido con" ma:internalName="SharedWithUsers" ma:readOnly="true">
+      <xsd:complexType>
+        <xsd:complexContent>
+          <xsd:extension base="dms:UserMulti">
+            <xsd:sequence>
+              <xsd:element name="UserInfo" minOccurs="0" maxOccurs="unbounded">
+                <xsd:complexType>
+                  <xsd:sequence>
+                    <xsd:element name="DisplayName" type="xsd:string" minOccurs="0"/>
+                    <xsd:element name="AccountId" type="dms:UserId" minOccurs="0" nillable="true"/>
+                    <xsd:element name="AccountType" type="xsd:string" minOccurs="0"/>
+                  </xsd:sequence>
+                </xsd:complexType>
+              </xsd:element>
+            </xsd:sequence>
+          </xsd:extension>
+        </xsd:complexContent>
+      </xsd:complexType>
+    </xsd:element>
+    <xsd:element name="SharedWithDetails" ma:index="9" nillable="true" ma:displayName="Detalles de uso compartido" ma:internalName="SharedWithDetails" ma:readOnly="true">
+      <xsd:simpleType>
+        <xsd:restriction base="dms:Note">
+          <xsd:maxLength value="255"/>
+        </xsd:restriction>
+      </xsd:simpleType>
+    </xsd:element>
+    <xsd:element name="TaxCatchAll" ma:index="20" nillable="true" ma:displayName="Taxonomy Catch All Column" ma:hidden="true" ma:list="{2f40a149-578b-41a1-8845-c88bc1831770}" ma:internalName="TaxCatchAll" ma:showField="CatchAllData" ma:web="cb45339b-ced9-4d0d-8f64-77573914d53b">
+      <xsd:complexType>
+        <xsd:complexContent>
+          <xsd:extension base="dms:MultiChoiceLookup">
+            <xsd:sequence>
+              <xsd:element name="Value" type="dms:Lookup" maxOccurs="unbounded" minOccurs="0" nillable="true"/>
+            </xsd:sequence>
+          </xsd:extension>
+        </xsd:complexContent>
+      </xsd:complexType>
+    </xsd:element>
+  </xsd:schema>
+  <xsd:schema xmlns:xsd="http://www.w3.org/2001/XMLSchema" xmlns:xs="http://www.w3.org/2001/XMLSchema" xmlns:dms="http://schemas.microsoft.com/office/2006/documentManagement/types" xmlns:pc="http://schemas.microsoft.com/office/infopath/2007/PartnerControls" targetNamespace="43a3ca16-9c26-4813-b83f-4aec9927b43f" elementFormDefault="qualified">
+    <xsd:import namespace="http://schemas.microsoft.com/office/2006/documentManagement/types"/>
+    <xsd:import namespace="http://schemas.microsoft.com/office/infopath/2007/PartnerControls"/>
+    <xsd:element name="MediaServiceMetadata" ma:index="10" nillable="true" ma:displayName="MediaServiceMetadata" ma:hidden="true" ma:internalName="MediaServiceMetadata" ma:readOnly="true">
       <xsd:simpleType>
         <xsd:restriction base="dms:Note"/>
       </xsd:simpleType>
     </xsd:element>
-    <xsd:element name="MediaServiceFastMetadata" ma:index="9" nillable="true" ma:displayName="MediaServiceFastMetadata" ma:hidden="true" ma:internalName="MediaServiceFastMetadata" ma:readOnly="true">
+    <xsd:element name="MediaServiceFastMetadata" ma:index="11" nillable="true" ma:displayName="MediaServiceFastMetadata" ma:hidden="true" ma:internalName="MediaServiceFastMetadata" ma:readOnly="true">
       <xsd:simpleType>
         <xsd:restriction base="dms:Note"/>
       </xsd:simpleType>
     </xsd:element>
-    <xsd:element name="MediaServiceSearchProperties" ma:index="10" nillable="true" ma:displayName="MediaServiceSearchProperties" ma:hidden="true" ma:internalName="MediaServiceSearchProperties" ma:readOnly="true">
-      <xsd:simpleType>
-        <xsd:restriction base="dms:Note"/>
-      </xsd:simpleType>
-    </xsd:element>
-    <xsd:element name="MediaServiceDateTaken" ma:index="11" nillable="true" ma:displayName="MediaServiceDateTaken" ma:hidden="true" ma:indexed="true" ma:internalName="MediaServiceDateTaken" ma:readOnly="true">
+    <xsd:element name="MediaServiceDateTaken" ma:index="12" nillable="true" ma:displayName="MediaServiceDateTaken" ma:hidden="true" ma:indexed="true" ma:internalName="MediaServiceDateTaken" ma:readOnly="true">
       <xsd:simpleType>
         <xsd:restriction base="dms:Text"/>
       </xsd:simpleType>
     </xsd:element>
-    <xsd:element name="lcf76f155ced4ddcb4097134ff3c332f" ma:index="13" nillable="true" ma:taxonomy="true" ma:internalName="lcf76f155ced4ddcb4097134ff3c332f" ma:taxonomyFieldName="MediaServiceImageTags" ma:displayName="Etiquetas de imagen" ma:readOnly="false" ma:fieldId="{5cf76f15-5ced-4ddc-b409-7134ff3c332f}" ma:taxonomyMulti="true" ma:sspId="d33c8c81-5745-4931-bcc4-c2aeafe86780" ma:termSetId="09814cd3-568e-fe90-9814-8d621ff8fb84" ma:anchorId="fba54fb3-c3e1-fe81-a776-ca4b69148c4d" ma:open="true" ma:isKeyword="false">
-      <xsd:complexType>
-        <xsd:sequence>
-          <xsd:element ref="pc:Terms" minOccurs="0" maxOccurs="1"/>
-        </xsd:sequence>
-      </xsd:complexType>
+    <xsd:element name="MediaServiceObjectDetectorVersions" ma:index="13" nillable="true" ma:displayName="MediaServiceObjectDetectorVersions" ma:hidden="true" ma:indexed="true" ma:internalName="MediaServiceObjectDetectorVersions" ma:readOnly="true">
+      <xsd:simpleType>
+        <xsd:restriction base="dms:Text"/>
+      </xsd:simpleType>
     </xsd:element>
-    <xsd:element name="MediaServiceOCR" ma:index="15" nillable="true" ma:displayName="Extracted Text" ma:internalName="MediaServiceOCR" ma:readOnly="true">
+    <xsd:element name="MediaLengthInSeconds" ma:index="14" nillable="true" ma:displayName="MediaLengthInSeconds" ma:hidden="true" ma:internalName="MediaLengthInSeconds" ma:readOnly="true">
       <xsd:simpleType>
-        <xsd:restriction base="dms:Note">
-          <xsd:maxLength value="255"/>
-        </xsd:restriction>
+        <xsd:restriction base="dms:Unknown"/>
+      </xsd:simpleType>
+    </xsd:element>
+    <xsd:element name="MediaServiceLocation" ma:index="15" nillable="true" ma:displayName="Location" ma:indexed="true" ma:internalName="MediaServiceLocation" ma:readOnly="true">
+      <xsd:simpleType>
+        <xsd:restriction base="dms:Text"/>
       </xsd:simpleType>
     </xsd:element>
     <xsd:element name="MediaServiceGenerationTime" ma:index="16" nillable="true" ma:displayName="MediaServiceGenerationTime" ma:hidden="true" ma:internalName="MediaServiceGenerationTime" ma:readOnly="true">
@@ -29060,25 +28897,24 @@
         <xsd:restriction base="dms:Text"/>
       </xsd:simpleType>
     </xsd:element>
-    <xsd:element name="MediaLengthInSeconds" ma:index="18" nillable="true" ma:displayName="MediaLengthInSeconds" ma:hidden="true" ma:internalName="MediaLengthInSeconds" ma:readOnly="true">
+    <xsd:element name="lcf76f155ced4ddcb4097134ff3c332f" ma:index="19" nillable="true" ma:taxonomy="true" ma:internalName="lcf76f155ced4ddcb4097134ff3c332f" ma:taxonomyFieldName="MediaServiceImageTags" ma:displayName="Etiquetas de imagen" ma:readOnly="false" ma:fieldId="{5cf76f15-5ced-4ddc-b409-7134ff3c332f}" ma:taxonomyMulti="true" ma:sspId="d33c8c81-5745-4931-bcc4-c2aeafe86780" ma:termSetId="09814cd3-568e-fe90-9814-8d621ff8fb84" ma:anchorId="fba54fb3-c3e1-fe81-a776-ca4b69148c4d" ma:open="true" ma:isKeyword="false">
+      <xsd:complexType>
+        <xsd:sequence>
+          <xsd:element ref="pc:Terms" minOccurs="0" maxOccurs="1"/>
+        </xsd:sequence>
+      </xsd:complexType>
+    </xsd:element>
+    <xsd:element name="MediaServiceOCR" ma:index="21" nillable="true" ma:displayName="Extracted Text" ma:internalName="MediaServiceOCR" ma:readOnly="true">
       <xsd:simpleType>
-        <xsd:restriction base="dms:Unknown"/>
+        <xsd:restriction base="dms:Note">
+          <xsd:maxLength value="255"/>
+        </xsd:restriction>
       </xsd:simpleType>
     </xsd:element>
-  </xsd:schema>
-  <xsd:schema xmlns:xsd="http://www.w3.org/2001/XMLSchema" xmlns:xs="http://www.w3.org/2001/XMLSchema" xmlns:dms="http://schemas.microsoft.com/office/2006/documentManagement/types" xmlns:pc="http://schemas.microsoft.com/office/infopath/2007/PartnerControls" targetNamespace="285d351f-f218-493a-825f-85a9dfbde315" elementFormDefault="qualified">
-    <xsd:import namespace="http://schemas.microsoft.com/office/2006/documentManagement/types"/>
-    <xsd:import namespace="http://schemas.microsoft.com/office/infopath/2007/PartnerControls"/>
-    <xsd:element name="TaxCatchAll" ma:index="14" nillable="true" ma:displayName="Taxonomy Catch All Column" ma:hidden="true" ma:list="{5d57ac59-ec13-4ab6-8bf8-a162ea89df9b}" ma:internalName="TaxCatchAll" ma:showField="CatchAllData" ma:web="285d351f-f218-493a-825f-85a9dfbde315">
-      <xsd:complexType>
-        <xsd:complexContent>
-          <xsd:extension base="dms:MultiChoiceLookup">
-            <xsd:sequence>
-              <xsd:element name="Value" type="dms:Lookup" maxOccurs="unbounded" minOccurs="0" nillable="true"/>
-            </xsd:sequence>
-          </xsd:extension>
-        </xsd:complexContent>
-      </xsd:complexType>
+    <xsd:element name="MediaServiceSearchProperties" ma:index="22" nillable="true" ma:displayName="MediaServiceSearchProperties" ma:hidden="true" ma:internalName="MediaServiceSearchProperties" ma:readOnly="true">
+      <xsd:simpleType>
+        <xsd:restriction base="dms:Note"/>
+      </xsd:simpleType>
     </xsd:element>
   </xsd:schema>
   <xsd:schema xmlns="http://schemas.openxmlformats.org/package/2006/metadata/core-properties" xmlns:xsd="http://www.w3.org/2001/XMLSchema" xmlns:xsi="http://www.w3.org/2001/XMLSchema-instance" xmlns:dc="http://purl.org/dc/elements/1.1/" xmlns:dcterms="http://purl.org/dc/terms/" xmlns:odoc="http://schemas.microsoft.com/internal/obd" targetNamespace="http://schemas.openxmlformats.org/package/2006/metadata/core-properties" elementFormDefault="qualified" attributeFormDefault="unqualified" blockDefault="#all">
@@ -29213,11 +29049,11 @@
 </file>
 
 <file path=customXml/itemProps4.xml><?xml version="1.0" encoding="utf-8"?>
-<ds:datastoreItem xmlns:ds="http://schemas.openxmlformats.org/officeDocument/2006/customXml" ds:itemID="{36C76C4F-B312-4A50-92C9-D481CEFDBC63}"/>
+<ds:datastoreItem xmlns:ds="http://schemas.openxmlformats.org/officeDocument/2006/customXml" ds:itemID="{2FB68DC4-5924-40FA-AD5D-18C59168B424}"/>
 </file>
 
 <file path=customXml/itemProps5.xml><?xml version="1.0" encoding="utf-8"?>
-<ds:datastoreItem xmlns:ds="http://schemas.openxmlformats.org/officeDocument/2006/customXml" ds:itemID="{8D3FF7B4-FAC6-4559-983C-E3EBEAF75866}">
+<ds:datastoreItem xmlns:ds="http://schemas.openxmlformats.org/officeDocument/2006/customXml" ds:itemID="{080C867E-1A3A-4517-ACDC-FD03BB0B4C99}">
   <ds:schemaRefs>
     <ds:schemaRef ds:uri="http://schemas.openxmlformats.org/officeDocument/2006/bibliography"/>
   </ds:schemaRefs>

</xml_diff>